<commit_message>
Membuat Praktikum Kosentrasi Komputer
</commit_message>
<xml_diff>
--- a/Administratif/Borang_1_Pendaftaran_TA/05. [Form B2] Bukti bebas Praktikum.docx
+++ b/Administratif/Borang_1_Pendaftaran_TA/05. [Form B2] Bukti bebas Praktikum.docx
@@ -105,7 +105,7 @@
           <w:szCs w:val="20"/>
           <w:lang w:val="en-US" w:eastAsia="en-US"/>
         </w:rPr>
-        <w:pict>
+        <w:pict w14:anchorId="6DAD8115">
           <v:rect id="_x0000_s1027" style="position:absolute;margin-left:81.2pt;margin-top:13.6pt;width:11.8pt;height:7.6pt;z-index:251661312"/>
         </w:pict>
       </w:r>
@@ -120,7 +120,7 @@
           <w:szCs w:val="20"/>
           <w:lang w:val="en-US" w:eastAsia="en-US"/>
         </w:rPr>
-        <w:pict>
+        <w:pict w14:anchorId="343E066E">
           <v:rect id="_x0000_s1026" style="position:absolute;margin-left:81.1pt;margin-top:1.6pt;width:11.8pt;height:7.6pt;z-index:251660288"/>
         </w:pict>
       </w:r>
@@ -255,7 +255,7 @@
     </w:p>
     <w:tbl>
       <w:tblPr>
-        <w:tblStyle w:val="KisiTabel"/>
+        <w:tblStyle w:val="TableGrid"/>
         <w:tblW w:w="0" w:type="auto"/>
         <w:tblInd w:w="108" w:type="dxa"/>
         <w:tblLook w:val="04A0" w:firstRow="1" w:lastRow="0" w:firstColumn="1" w:lastColumn="0" w:noHBand="0" w:noVBand="1"/>
@@ -976,27 +976,7 @@
                 <w:u w:val="single"/>
                 <w:lang w:val="en-US"/>
               </w:rPr>
-              <w:t xml:space="preserve"> </w:t>
-            </w:r>
-            <w:proofErr w:type="spellStart"/>
-            <w:r>
-              <w:rPr>
-                <w:rFonts w:ascii="Times New Roman" w:hAnsi="Times New Roman"/>
-                <w:color w:val="000000"/>
-                <w:u w:val="single"/>
-                <w:lang w:val="en-US"/>
-              </w:rPr>
-              <w:t>Sistem</w:t>
-            </w:r>
-            <w:proofErr w:type="spellEnd"/>
-            <w:r>
-              <w:rPr>
-                <w:rFonts w:ascii="Times New Roman" w:hAnsi="Times New Roman"/>
-                <w:color w:val="000000"/>
-                <w:u w:val="single"/>
-                <w:lang w:val="en-US"/>
-              </w:rPr>
-              <w:t xml:space="preserve"> Digital                                                       </w:t>
+              <w:t xml:space="preserve"> Sistem Digital                                                       </w:t>
             </w:r>
             <w:r>
               <w:rPr>
@@ -1156,7 +1136,25 @@
                 <w:u w:val="single"/>
                 <w:lang w:val="en-US"/>
               </w:rPr>
-              <w:t xml:space="preserve"> Tenaga Listrik                                          </w:t>
+              <w:t xml:space="preserve"> </w:t>
+            </w:r>
+            <w:r>
+              <w:rPr>
+                <w:rFonts w:ascii="Times New Roman" w:hAnsi="Times New Roman"/>
+                <w:color w:val="000000"/>
+                <w:u w:val="single"/>
+                <w:lang w:val="en-US"/>
+              </w:rPr>
+              <w:t>Embedded</w:t>
+            </w:r>
+            <w:r>
+              <w:rPr>
+                <w:rFonts w:ascii="Times New Roman" w:hAnsi="Times New Roman"/>
+                <w:color w:val="000000"/>
+                <w:u w:val="single"/>
+                <w:lang w:val="en-US"/>
+              </w:rPr>
+              <w:t xml:space="preserve">                                          </w:t>
             </w:r>
             <w:r>
               <w:rPr>
@@ -1227,7 +1225,7 @@
                 <w:u w:val="single"/>
                 <w:lang w:val="en-US"/>
               </w:rPr>
-              <w:t>Sistem</w:t>
+              <w:t>Jaringan</w:t>
             </w:r>
             <w:proofErr w:type="spellEnd"/>
             <w:r>
@@ -1247,7 +1245,7 @@
                 <w:u w:val="single"/>
                 <w:lang w:val="en-US"/>
               </w:rPr>
-              <w:t>Energi</w:t>
+              <w:t>Komputer</w:t>
             </w:r>
             <w:proofErr w:type="spellEnd"/>
             <w:r>
@@ -1257,8 +1255,92 @@
                 <w:u w:val="single"/>
                 <w:lang w:val="en-US"/>
               </w:rPr>
-              <w:t xml:space="preserve">                                                       </w:t>
-            </w:r>
+              <w:tab/>
+            </w:r>
+            <w:r>
+              <w:rPr>
+                <w:rFonts w:ascii="Times New Roman" w:hAnsi="Times New Roman"/>
+                <w:color w:val="000000"/>
+              </w:rPr>
+              <w:t>Lulus /Tidak Lulus*</w:t>
+            </w:r>
+          </w:p>
+          <w:p>
+            <w:pPr>
+              <w:widowControl w:val="0"/>
+              <w:tabs>
+                <w:tab w:val="left" w:pos="5991"/>
+              </w:tabs>
+              <w:autoSpaceDE w:val="0"/>
+              <w:autoSpaceDN w:val="0"/>
+              <w:adjustRightInd w:val="0"/>
+              <w:spacing w:line="240" w:lineRule="auto"/>
+              <w:ind w:left="468"/>
+              <w:jc w:val="both"/>
+              <w:rPr>
+                <w:rFonts w:ascii="Times New Roman" w:hAnsi="Times New Roman"/>
+                <w:color w:val="000000"/>
+              </w:rPr>
+            </w:pPr>
+            <w:r>
+              <w:rPr>
+                <w:rFonts w:ascii="Times New Roman" w:hAnsi="Times New Roman"/>
+                <w:color w:val="000000"/>
+                <w:lang w:val="en-US"/>
+              </w:rPr>
+              <w:t xml:space="preserve">9. </w:t>
+            </w:r>
+            <w:proofErr w:type="spellStart"/>
+            <w:r>
+              <w:rPr>
+                <w:rFonts w:ascii="Times New Roman" w:hAnsi="Times New Roman"/>
+                <w:color w:val="000000"/>
+                <w:u w:val="single"/>
+                <w:lang w:val="en-US"/>
+              </w:rPr>
+              <w:t>Praktikum</w:t>
+            </w:r>
+            <w:proofErr w:type="spellEnd"/>
+            <w:r>
+              <w:rPr>
+                <w:rFonts w:ascii="Times New Roman" w:hAnsi="Times New Roman"/>
+                <w:color w:val="000000"/>
+                <w:u w:val="single"/>
+                <w:lang w:val="en-US"/>
+              </w:rPr>
+              <w:t xml:space="preserve"> </w:t>
+            </w:r>
+            <w:proofErr w:type="spellStart"/>
+            <w:r>
+              <w:rPr>
+                <w:rFonts w:ascii="Times New Roman" w:hAnsi="Times New Roman"/>
+                <w:color w:val="000000"/>
+                <w:u w:val="single"/>
+                <w:lang w:val="en-US"/>
+              </w:rPr>
+              <w:t>Pemrosesan</w:t>
+            </w:r>
+            <w:proofErr w:type="spellEnd"/>
+            <w:r>
+              <w:rPr>
+                <w:rFonts w:ascii="Times New Roman" w:hAnsi="Times New Roman"/>
+                <w:color w:val="000000"/>
+                <w:u w:val="single"/>
+                <w:lang w:val="en-US"/>
+              </w:rPr>
+              <w:t xml:space="preserve"> </w:t>
+            </w:r>
+            <w:proofErr w:type="spellStart"/>
+            <w:r>
+              <w:rPr>
+                <w:rFonts w:ascii="Times New Roman" w:hAnsi="Times New Roman"/>
+                <w:color w:val="000000"/>
+                <w:u w:val="single"/>
+                <w:lang w:val="en-US"/>
+              </w:rPr>
+              <w:t>Paralel</w:t>
+            </w:r>
+            <w:proofErr w:type="spellEnd"/>
             <w:r>
               <w:rPr>
                 <w:rFonts w:ascii="Times New Roman" w:hAnsi="Times New Roman"/>
@@ -1751,7 +1833,7 @@
         <w:lang w:val="en-US" w:eastAsia="en-US"/>
       </w:rPr>
       <w:drawing>
-        <wp:inline distT="0" distB="0" distL="0" distR="0">
+        <wp:inline distT="0" distB="0" distL="0" distR="0" wp14:anchorId="4A5AFAC5" wp14:editId="1F532F29">
           <wp:extent cx="5725795" cy="1428750"/>
           <wp:effectExtent l="19050" t="0" r="8255" b="0"/>
           <wp:docPr id="4" name="Picture 1"/>
@@ -1973,7 +2055,7 @@
     <w:lsdException w:name="Table Web 2" w:semiHidden="1" w:unhideWhenUsed="1"/>
     <w:lsdException w:name="Table Web 3" w:semiHidden="1" w:unhideWhenUsed="1"/>
     <w:lsdException w:name="Balloon Text" w:semiHidden="1" w:unhideWhenUsed="1"/>
-    <w:lsdException w:name="Table Grid" w:semiHidden="1" w:uiPriority="59" w:unhideWhenUsed="1"/>
+    <w:lsdException w:name="Table Grid" w:uiPriority="59"/>
     <w:lsdException w:name="Table Theme" w:semiHidden="1" w:unhideWhenUsed="1"/>
     <w:lsdException w:name="Placeholder Text" w:semiHidden="1"/>
     <w:lsdException w:name="No Spacing" w:uiPriority="1" w:qFormat="1"/>
@@ -2210,13 +2292,13 @@
       <w:lang w:val="id-ID" w:eastAsia="id-ID"/>
     </w:rPr>
   </w:style>
-  <w:style w:type="character" w:default="1" w:styleId="FontParagrafDefault">
+  <w:style w:type="character" w:default="1" w:styleId="DefaultParagraphFont">
     <w:name w:val="Default Paragraph Font"/>
     <w:uiPriority w:val="1"/>
     <w:semiHidden/>
     <w:unhideWhenUsed/>
   </w:style>
-  <w:style w:type="table" w:default="1" w:styleId="TabelNormal">
+  <w:style w:type="table" w:default="1" w:styleId="TableNormal">
     <w:name w:val="Normal Table"/>
     <w:uiPriority w:val="99"/>
     <w:semiHidden/>
@@ -2231,15 +2313,15 @@
       </w:tblCellMar>
     </w:tblPr>
   </w:style>
-  <w:style w:type="numbering" w:default="1" w:styleId="TidakAdaDaftar">
+  <w:style w:type="numbering" w:default="1" w:styleId="NoList">
     <w:name w:val="No List"/>
     <w:uiPriority w:val="99"/>
     <w:semiHidden/>
     <w:unhideWhenUsed/>
   </w:style>
-  <w:style w:type="table" w:styleId="KisiTabel">
+  <w:style w:type="table" w:styleId="TableGrid">
     <w:name w:val="Table Grid"/>
-    <w:basedOn w:val="TabelNormal"/>
+    <w:basedOn w:val="TableNormal"/>
     <w:uiPriority w:val="59"/>
     <w:rsid w:val="00945935"/>
     <w:pPr>
@@ -2264,7 +2346,7 @@
   <w:style w:type="paragraph" w:styleId="Header">
     <w:name w:val="header"/>
     <w:basedOn w:val="Normal"/>
-    <w:link w:val="HeaderKAR"/>
+    <w:link w:val="HeaderChar"/>
     <w:uiPriority w:val="99"/>
     <w:semiHidden/>
     <w:unhideWhenUsed/>
@@ -2277,9 +2359,9 @@
       <w:spacing w:after="0" w:line="240" w:lineRule="auto"/>
     </w:pPr>
   </w:style>
-  <w:style w:type="character" w:customStyle="1" w:styleId="HeaderKAR">
-    <w:name w:val="Header KAR"/>
-    <w:basedOn w:val="FontParagrafDefault"/>
+  <w:style w:type="character" w:customStyle="1" w:styleId="HeaderChar">
+    <w:name w:val="Header Char"/>
+    <w:basedOn w:val="DefaultParagraphFont"/>
     <w:link w:val="Header"/>
     <w:uiPriority w:val="99"/>
     <w:semiHidden/>
@@ -2293,7 +2375,7 @@
   <w:style w:type="paragraph" w:styleId="Footer">
     <w:name w:val="footer"/>
     <w:basedOn w:val="Normal"/>
-    <w:link w:val="FooterKAR"/>
+    <w:link w:val="FooterChar"/>
     <w:uiPriority w:val="99"/>
     <w:semiHidden/>
     <w:unhideWhenUsed/>
@@ -2306,9 +2388,9 @@
       <w:spacing w:after="0" w:line="240" w:lineRule="auto"/>
     </w:pPr>
   </w:style>
-  <w:style w:type="character" w:customStyle="1" w:styleId="FooterKAR">
-    <w:name w:val="Footer KAR"/>
-    <w:basedOn w:val="FontParagrafDefault"/>
+  <w:style w:type="character" w:customStyle="1" w:styleId="FooterChar">
+    <w:name w:val="Footer Char"/>
+    <w:basedOn w:val="DefaultParagraphFont"/>
     <w:link w:val="Footer"/>
     <w:uiPriority w:val="99"/>
     <w:semiHidden/>
@@ -2319,10 +2401,10 @@
       <w:lang w:val="id-ID" w:eastAsia="id-ID"/>
     </w:rPr>
   </w:style>
-  <w:style w:type="paragraph" w:styleId="TeksBalon">
+  <w:style w:type="paragraph" w:styleId="BalloonText">
     <w:name w:val="Balloon Text"/>
     <w:basedOn w:val="Normal"/>
-    <w:link w:val="TeksBalonKAR"/>
+    <w:link w:val="BalloonTextChar"/>
     <w:uiPriority w:val="99"/>
     <w:semiHidden/>
     <w:unhideWhenUsed/>
@@ -2336,10 +2418,10 @@
       <w:szCs w:val="16"/>
     </w:rPr>
   </w:style>
-  <w:style w:type="character" w:customStyle="1" w:styleId="TeksBalonKAR">
-    <w:name w:val="Teks Balon KAR"/>
-    <w:basedOn w:val="FontParagrafDefault"/>
-    <w:link w:val="TeksBalon"/>
+  <w:style w:type="character" w:customStyle="1" w:styleId="BalloonTextChar">
+    <w:name w:val="Balloon Text Char"/>
+    <w:basedOn w:val="DefaultParagraphFont"/>
+    <w:link w:val="BalloonText"/>
     <w:uiPriority w:val="99"/>
     <w:semiHidden/>
     <w:rsid w:val="00945935"/>

</xml_diff>